<commit_message>
feat(review): close bounded DOCX Review Gate C
</commit_message>
<xml_diff>
--- a/test/fixtures/revision-bridge/v1/docx-review-evidence-v1.docx
+++ b/test/fixtures/revision-bridge/v1/docx-review-evidence-v1.docx
@@ -13,16 +13,22 @@
       </w:r>
     </w:p>
     <w:p>
-      <w:ins w:id="1" w:author="reviewer">
+      <w:r>
+        <w:t xml:space="preserve">Alpha </w:t>
+      </w:r>
+      <w:del w:id="1" w:author="reviewer" w:date="2026-07-12T00:00:00.000Z">
         <w:r>
-          <w:t>Inserted diagnostic</w:t>
+          <w:delText>beta</w:delText>
+        </w:r>
+      </w:del>
+      <w:ins w:id="2" w:author="reviewer" w:date="2026-07-12T00:00:00.000Z">
+        <w:r>
+          <w:t>delta</w:t>
         </w:r>
       </w:ins>
-      <w:del w:id="2" w:author="reviewer">
-        <w:r>
-          <w:delText>Deleted diagnostic</w:delText>
-        </w:r>
-      </w:del>
+      <w:r>
+        <w:t xml:space="preserve"> gamma.</w:t>
+      </w:r>
     </w:p>
   </w:body>
 </w:document>

</xml_diff>